<commit_message>
Update PRD : new sequence
</commit_message>
<xml_diff>
--- a/VKFoodTour-PRD.docx
+++ b/VKFoodTour-PRD.docx
@@ -6354,15 +6354,1069 @@
     </w:p>
     <w:p>
       <w:pPr>
-        <w:rPr>
-          <w:sz w:val="24"/>
-          <w:szCs w:val="24"/>
-        </w:rPr>
+        <w:pStyle w:val="Heading3"/>
+      </w:pPr>
+      <w:r>
+        <w:t>6</w:t>
+      </w:r>
+      <w:r>
+        <w:t xml:space="preserve">. Sequence </w:t>
+      </w:r>
+      <w:r>
+        <w:t>g</w:t>
+      </w:r>
+      <w:r>
+        <w:t>ắn POI trên bản đồ</w:t>
+      </w:r>
+    </w:p>
+    <w:p>
+      <w:pPr>
+        <w:pStyle w:val="Heading3"/>
+      </w:pPr>
+      <w:r>
+        <w:rPr>
+          <w:noProof/>
+        </w:rPr>
+        <w:drawing>
+          <wp:inline distT="0" distB="0" distL="0" distR="0" wp14:anchorId="6627673D" wp14:editId="11AEE26B">
+            <wp:extent cx="5943600" cy="4371975"/>
+            <wp:effectExtent l="0" t="0" r="0" b="9525"/>
+            <wp:docPr id="1029210408" name="Picture 1"/>
+            <wp:cNvGraphicFramePr>
+              <a:graphicFrameLocks xmlns:a="http://schemas.openxmlformats.org/drawingml/2006/main" noChangeAspect="1"/>
+            </wp:cNvGraphicFramePr>
+            <a:graphic xmlns:a="http://schemas.openxmlformats.org/drawingml/2006/main">
+              <a:graphicData uri="http://schemas.openxmlformats.org/drawingml/2006/picture">
+                <pic:pic xmlns:pic="http://schemas.openxmlformats.org/drawingml/2006/picture">
+                  <pic:nvPicPr>
+                    <pic:cNvPr id="0" name="Picture 1"/>
+                    <pic:cNvPicPr>
+                      <a:picLocks noChangeAspect="1" noChangeArrowheads="1"/>
+                    </pic:cNvPicPr>
+                  </pic:nvPicPr>
+                  <pic:blipFill>
+                    <a:blip r:embed="rId17" cstate="print">
+                      <a:extLst>
+                        <a:ext uri="{28A0092B-C50C-407E-A947-70E740481C1C}">
+                          <a14:useLocalDpi xmlns:a14="http://schemas.microsoft.com/office/drawing/2010/main" val="0"/>
+                        </a:ext>
+                      </a:extLst>
+                    </a:blip>
+                    <a:srcRect/>
+                    <a:stretch>
+                      <a:fillRect/>
+                    </a:stretch>
+                  </pic:blipFill>
+                  <pic:spPr bwMode="auto">
+                    <a:xfrm>
+                      <a:off x="0" y="0"/>
+                      <a:ext cx="5943600" cy="4371975"/>
+                    </a:xfrm>
+                    <a:prstGeom prst="rect">
+                      <a:avLst/>
+                    </a:prstGeom>
+                    <a:noFill/>
+                    <a:ln>
+                      <a:noFill/>
+                    </a:ln>
+                  </pic:spPr>
+                </pic:pic>
+              </a:graphicData>
+            </a:graphic>
+          </wp:inline>
+        </w:drawing>
+      </w:r>
+    </w:p>
+    <w:p>
+      <w:pPr>
+        <w:pStyle w:val="Heading3"/>
+      </w:pPr>
+      <w:r>
+        <w:lastRenderedPageBreak/>
+        <w:t>6.1. Mô tả tổng quan</w:t>
+      </w:r>
+    </w:p>
+    <w:p>
+      <w:pPr>
+        <w:pStyle w:val="Heading3"/>
+        <w:rPr>
+          <w:b w:val="0"/>
+          <w:bCs w:val="0"/>
+        </w:rPr>
+      </w:pPr>
+      <w:r>
+        <w:rPr>
+          <w:b w:val="0"/>
+          <w:bCs w:val="0"/>
+        </w:rPr>
+        <w:t>Chức năng hiển thị toàn bộ gian hàng (POI) active dưới dạng **ghim (Pin)** trên bản đồ toàn màn hình trong ứng dụng mobile. Mỗi Pin đại diện cho một gian hàng tại vị trí thực tế trên phố Vĩnh Khánh, cho phép du khách trực quan hóa vị trí các quán ăn xung quanh và bấm vào Pin để xem chi tiết gian hàng (ảnh, thực đơn, audio thuyết minh).</w:t>
+      </w:r>
+    </w:p>
+    <w:p>
+      <w:pPr>
+        <w:pStyle w:val="Heading3"/>
+        <w:rPr>
+          <w:b w:val="0"/>
+          <w:bCs w:val="0"/>
+        </w:rPr>
+      </w:pPr>
+      <w:r>
+        <w:rPr>
+          <w:b w:val="0"/>
+          <w:bCs w:val="0"/>
+        </w:rPr>
+        <w:t>Luồng này bao gồm 4 giai đoạn: tải danh sách POI từ API → điều hướng đến bản đồ → gắn Pins lên bản đồ → du khách tương tác với Pin.</w:t>
+      </w:r>
+    </w:p>
+    <w:p>
+      <w:pPr>
+        <w:pStyle w:val="Heading3"/>
+      </w:pPr>
+      <w:r>
+        <w:t>6.2. Điều kiện tiên quyết</w:t>
+      </w:r>
+    </w:p>
+    <w:p>
+      <w:pPr>
+        <w:pStyle w:val="Heading3"/>
+        <w:rPr>
+          <w:b w:val="0"/>
+          <w:bCs w:val="0"/>
+        </w:rPr>
+      </w:pPr>
+      <w:r>
+        <w:rPr>
+          <w:b w:val="0"/>
+          <w:bCs w:val="0"/>
+        </w:rPr>
+        <w:t>- App đã cài đặt trên thiết bị Android, Google Maps API key đã cấu hình trong `AndroidManifest.xml`.</w:t>
+      </w:r>
+    </w:p>
+    <w:p>
+      <w:pPr>
+        <w:pStyle w:val="Heading3"/>
+        <w:rPr>
+          <w:b w:val="0"/>
+          <w:bCs w:val="0"/>
+        </w:rPr>
+      </w:pPr>
+      <w:r>
+        <w:rPr>
+          <w:b w:val="0"/>
+          <w:bCs w:val="0"/>
+        </w:rPr>
+        <w:t>- `.UseMauiMaps()` đã đăng ký trong `MauiProgram.cs`.</w:t>
+      </w:r>
+    </w:p>
+    <w:p>
+      <w:pPr>
+        <w:pStyle w:val="Heading3"/>
+        <w:rPr>
+          <w:b w:val="0"/>
+          <w:bCs w:val="0"/>
+        </w:rPr>
+      </w:pPr>
+      <w:r>
+        <w:rPr>
+          <w:b w:val="0"/>
+          <w:bCs w:val="0"/>
+        </w:rPr>
+        <w:t>- Backend API đang chạy và có ít nhất 1 POI active trong DB với tọa độ GPS hợp lệ (khác 0,0).</w:t>
+      </w:r>
+    </w:p>
+    <w:p>
+      <w:pPr>
+        <w:pStyle w:val="Heading3"/>
+        <w:rPr>
+          <w:b w:val="0"/>
+          <w:bCs w:val="0"/>
+        </w:rPr>
+      </w:pPr>
+      <w:r>
+        <w:rPr>
+          <w:b w:val="0"/>
+          <w:bCs w:val="0"/>
+        </w:rPr>
+        <w:t>- Route `//fullmap` đã đăng ký trong `AppShell.xaml`.</w:t>
+      </w:r>
+    </w:p>
+    <w:p>
+      <w:pPr>
+        <w:pStyle w:val="Heading3"/>
+      </w:pPr>
+      <w:r>
+        <w:t>6.3. Giải thích từng bước trong Sequence Diagram</w:t>
+      </w:r>
+    </w:p>
+    <w:p>
+      <w:pPr>
+        <w:pStyle w:val="Heading3"/>
+        <w:rPr>
+          <w:b w:val="0"/>
+          <w:bCs w:val="0"/>
+        </w:rPr>
+      </w:pPr>
+      <w:r>
+        <w:t>Bước 1–15:</w:t>
+      </w:r>
+      <w:r>
+        <w:rPr>
+          <w:b w:val="0"/>
+          <w:bCs w:val="0"/>
+        </w:rPr>
+        <w:t xml:space="preserve"> Tải danh sách POI (Giai đoạn 1)**</w:t>
+      </w:r>
+    </w:p>
+    <w:p>
+      <w:pPr>
+        <w:pStyle w:val="Heading3"/>
+        <w:rPr>
+          <w:b w:val="0"/>
+          <w:bCs w:val="0"/>
+        </w:rPr>
+      </w:pPr>
+      <w:r>
+        <w:rPr>
+          <w:b w:val="0"/>
+          <w:bCs w:val="0"/>
+        </w:rPr>
+        <w:t>Khi du khách mở app, `HomePage.OnAppearing()` được gọi. Trang này thực hiện 2 việc song song: (1) di chuyển miniMap tới khu vực Vĩnh Khánh, (2) gọi `LoadDataCommand.ExecuteAsync(null)` trên `HomeViewModel`.</w:t>
+      </w:r>
+    </w:p>
+    <w:p>
+      <w:pPr>
+        <w:pStyle w:val="Heading3"/>
+        <w:rPr>
+          <w:b w:val="0"/>
+          <w:bCs w:val="0"/>
+        </w:rPr>
+      </w:pPr>
+      <w:r>
+        <w:rPr>
+          <w:b w:val="0"/>
+          <w:bCs w:val="0"/>
+        </w:rPr>
+        <w:t>ViewModel kiểm tra cờ `IsBusy` để tránh gọi trùng lặp, đặt `IsBusy = true`, rồi gọi `DataService.GetPoisAsync()`. DataService gửi `HTTP GET /api/Poi` đến backend. `PoiController.GetAllPois()` truy vấn DB:</w:t>
+      </w:r>
+    </w:p>
+    <w:p>
+      <w:pPr>
+        <w:pStyle w:val="Heading3"/>
+        <w:rPr>
+          <w:b w:val="0"/>
+          <w:bCs w:val="0"/>
+        </w:rPr>
+      </w:pPr>
+      <w:r>
+        <w:rPr>
+          <w:b w:val="0"/>
+          <w:bCs w:val="0"/>
+        </w:rPr>
+        <w:t>Pois.Where(IsActive).OrderBy(Priority).ThenBy(Name)</w:t>
+      </w:r>
+    </w:p>
+    <w:p>
+      <w:pPr>
+        <w:pStyle w:val="Heading3"/>
+        <w:rPr>
+          <w:b w:val="0"/>
+          <w:bCs w:val="0"/>
+        </w:rPr>
+      </w:pPr>
+      <w:r>
+        <w:rPr>
+          <w:b w:val="0"/>
+          <w:bCs w:val="0"/>
+        </w:rPr>
+        <w:t>và trả về `List&lt;PoiDto&gt;` chứa: PoiId, Name, Address, **Latitude** (decimal), **Longitude** (decimal), Radius, Priority, Description, ImageUrl.</w:t>
+      </w:r>
+    </w:p>
+    <w:p>
+      <w:pPr>
+        <w:pStyle w:val="Heading3"/>
+        <w:rPr>
+          <w:b w:val="0"/>
+          <w:bCs w:val="0"/>
+        </w:rPr>
+      </w:pPr>
+      <w:r>
+        <w:rPr>
+          <w:b w:val="0"/>
+          <w:bCs w:val="0"/>
+        </w:rPr>
+        <w:t>DataService nhận response, gọi `MapToMobile(dto)` để chuyển đổi từ `PoiDto` (decimal) sang `Poi` model mobile (double) — vì `Microsoft.Maui.Maps.Location` yêu cầu `double` cho tọa độ. Mỗi POI cũng được gán emoji `CoverEmoji` dựa trên hash tên quán (`StallEmoji()`).</w:t>
+      </w:r>
+    </w:p>
+    <w:p>
+      <w:pPr>
+        <w:pStyle w:val="Heading3"/>
+        <w:rPr>
+          <w:b w:val="0"/>
+          <w:bCs w:val="0"/>
+        </w:rPr>
+      </w:pPr>
+      <w:r>
+        <w:rPr>
+          <w:b w:val="0"/>
+          <w:bCs w:val="0"/>
+        </w:rPr>
+        <w:t>Nếu API lỗi hoặc mất mạng, DataService trả về `FallbackDemo()` gồm 2 quán giả: "Ốc Oanh (Demo)" tại (10.758, 106.705) và "Ốc Vũ (Demo)" tại (10.759, 106.706).</w:t>
+      </w:r>
+    </w:p>
+    <w:p>
+      <w:pPr>
+        <w:pStyle w:val="Heading3"/>
+        <w:rPr>
+          <w:b w:val="0"/>
+          <w:bCs w:val="0"/>
+        </w:rPr>
+      </w:pPr>
+      <w:r>
+        <w:rPr>
+          <w:b w:val="0"/>
+          <w:bCs w:val="0"/>
+        </w:rPr>
+        <w:t>ViewModel sắp xếp lại danh sách theo `Priority` giảm dần, gán vào `ObservableCollection&lt;Poi&gt; Pois`, đặt `IsBusy = false`.</w:t>
+      </w:r>
+    </w:p>
+    <w:p>
+      <w:pPr>
+        <w:pStyle w:val="Heading3"/>
+        <w:rPr>
+          <w:b w:val="0"/>
+          <w:bCs w:val="0"/>
+        </w:rPr>
+      </w:pPr>
+      <w:r>
+        <w:t>Bước 16–21:</w:t>
+      </w:r>
+      <w:r>
+        <w:rPr>
+          <w:b w:val="0"/>
+          <w:bCs w:val="0"/>
+        </w:rPr>
+        <w:t xml:space="preserve"> Điều hướng đến bản đồ (Giai đoạn 2)**</w:t>
+      </w:r>
+    </w:p>
+    <w:p>
+      <w:pPr>
+        <w:pStyle w:val="Heading3"/>
+        <w:rPr>
+          <w:b w:val="0"/>
+          <w:bCs w:val="0"/>
+        </w:rPr>
+      </w:pPr>
+      <w:r>
+        <w:rPr>
+          <w:b w:val="0"/>
+          <w:bCs w:val="0"/>
+        </w:rPr>
+        <w:lastRenderedPageBreak/>
+        <w:t>Du khách bấm nút "Xem bản đồ" trên HomePage. `HomeViewModel.OpenFullMapCommand` gọi `Shell.Current.GoToAsync("//fullmap")` — sử dụng route tuyệt đối `//fullmap` để chuyển tab. Shell điều hướng đến `FullMapPage`, inject `HomeViewModel` qua constructor DI.</w:t>
+      </w:r>
+    </w:p>
+    <w:p>
+      <w:pPr>
+        <w:pStyle w:val="Heading3"/>
+        <w:rPr>
+          <w:b w:val="0"/>
+          <w:bCs w:val="0"/>
+        </w:rPr>
+      </w:pPr>
+      <w:r>
+        <w:t>Bước 22–32:</w:t>
+      </w:r>
+      <w:r>
+        <w:rPr>
+          <w:b w:val="0"/>
+          <w:bCs w:val="0"/>
+        </w:rPr>
+        <w:t xml:space="preserve"> Gắn Pins lên bản đồ (Giai đoạn 3)**</w:t>
+      </w:r>
+    </w:p>
+    <w:p>
+      <w:pPr>
+        <w:pStyle w:val="Heading3"/>
+        <w:rPr>
+          <w:b w:val="0"/>
+          <w:bCs w:val="0"/>
+        </w:rPr>
+      </w:pPr>
+      <w:r>
+        <w:rPr>
+          <w:b w:val="0"/>
+          <w:bCs w:val="0"/>
+        </w:rPr>
+        <w:t>`FullMapPage.OnAppearing()` thực hiện chuỗi hành động:</w:t>
+      </w:r>
+    </w:p>
+    <w:p>
+      <w:pPr>
+        <w:pStyle w:val="Heading3"/>
+        <w:rPr>
+          <w:b w:val="0"/>
+          <w:bCs w:val="0"/>
+        </w:rPr>
+      </w:pPr>
+      <w:r>
+        <w:rPr>
+          <w:b w:val="0"/>
+          <w:bCs w:val="0"/>
+        </w:rPr>
+        <w:t>1. **Zoom bản đồ**: Tạo `Location(10.758, 106.705)` (trung tâm Vĩnh Khánh), gọi `bigMap.MoveToRegion(MapSpan.FromCenterAndRadius(vinhKhanh, Distance.FromMeters(500)))` để zoom bản đồ vào phạm vi 500m quanh phố ẩm thực.</w:t>
+      </w:r>
+    </w:p>
+    <w:p>
+      <w:pPr>
+        <w:pStyle w:val="Heading3"/>
+        <w:rPr>
+          <w:b w:val="0"/>
+          <w:bCs w:val="0"/>
+        </w:rPr>
+      </w:pPr>
+      <w:r>
+        <w:rPr>
+          <w:b w:val="0"/>
+          <w:bCs w:val="0"/>
+        </w:rPr>
+        <w:t>2. **Tải lại dữ liệu**: Gọi `vm.LoadDataCommand.ExecuteAsync(null)` để đảm bảo danh sách POI là mới nhất (phòng trường hợp Vendor vừa cập nhật thông tin quán).</w:t>
+      </w:r>
+    </w:p>
+    <w:p>
+      <w:pPr>
+        <w:pStyle w:val="Heading3"/>
+        <w:rPr>
+          <w:b w:val="0"/>
+          <w:bCs w:val="0"/>
+        </w:rPr>
+      </w:pPr>
+      <w:r>
+        <w:rPr>
+          <w:b w:val="0"/>
+          <w:bCs w:val="0"/>
+        </w:rPr>
+        <w:t>3. **Gắn Pins** — `ApplyPinsFromViewModel()`:</w:t>
+      </w:r>
+    </w:p>
+    <w:p>
+      <w:pPr>
+        <w:pStyle w:val="Heading3"/>
+        <w:rPr>
+          <w:b w:val="0"/>
+          <w:bCs w:val="0"/>
+        </w:rPr>
+      </w:pPr>
+      <w:r>
+        <w:rPr>
+          <w:b w:val="0"/>
+          <w:bCs w:val="0"/>
+        </w:rPr>
+        <w:t>   - `bigMap.Pins.Clear()` — xóa hết pins cũ tránh trùng lặp.</w:t>
+      </w:r>
+    </w:p>
+    <w:p>
+      <w:pPr>
+        <w:pStyle w:val="Heading3"/>
+        <w:rPr>
+          <w:b w:val="0"/>
+          <w:bCs w:val="0"/>
+        </w:rPr>
+      </w:pPr>
+      <w:r>
+        <w:rPr>
+          <w:b w:val="0"/>
+          <w:bCs w:val="0"/>
+        </w:rPr>
+        <w:t>   - Duyệt qua `vm.Pois`. Với mỗi POI:</w:t>
+      </w:r>
+    </w:p>
+    <w:p>
+      <w:pPr>
+        <w:pStyle w:val="Heading3"/>
+        <w:rPr>
+          <w:b w:val="0"/>
+          <w:bCs w:val="0"/>
+        </w:rPr>
+      </w:pPr>
+      <w:r>
+        <w:rPr>
+          <w:b w:val="0"/>
+          <w:bCs w:val="0"/>
+        </w:rPr>
+        <w:t>     - **Lọc tọa độ không hợp lệ**: nếu `Latitude ≈ 0` và `Longitude ≈ 0` (so sánh với `double.Epsilon`) → bỏ qua. Điều này loại bỏ POI chưa được Vendor cập nhật tọa độ.</w:t>
+      </w:r>
+    </w:p>
+    <w:p>
+      <w:pPr>
+        <w:pStyle w:val="Heading3"/>
+        <w:rPr>
+          <w:b w:val="0"/>
+          <w:bCs w:val="0"/>
+        </w:rPr>
+      </w:pPr>
+      <w:r>
+        <w:rPr>
+          <w:b w:val="0"/>
+          <w:bCs w:val="0"/>
+        </w:rPr>
+        <w:t>     - Tạo `Pin` mới:</w:t>
+      </w:r>
+    </w:p>
+    <w:p>
+      <w:pPr>
+        <w:pStyle w:val="Heading3"/>
+        <w:rPr>
+          <w:b w:val="0"/>
+          <w:bCs w:val="0"/>
+        </w:rPr>
+      </w:pPr>
+      <w:r>
+        <w:rPr>
+          <w:b w:val="0"/>
+          <w:bCs w:val="0"/>
+        </w:rPr>
+        <w:t>       - `Label = poi.Name` (tên quán hiện trên tooltip)</w:t>
+      </w:r>
+    </w:p>
+    <w:p>
+      <w:pPr>
+        <w:pStyle w:val="Heading3"/>
+        <w:rPr>
+          <w:b w:val="0"/>
+          <w:bCs w:val="0"/>
+        </w:rPr>
+      </w:pPr>
+      <w:r>
+        <w:rPr>
+          <w:b w:val="0"/>
+          <w:bCs w:val="0"/>
+        </w:rPr>
+        <w:t>       - `Address = poi.Address` (địa chỉ hiện dưới tooltip)</w:t>
+      </w:r>
+    </w:p>
+    <w:p>
+      <w:pPr>
+        <w:pStyle w:val="Heading3"/>
+        <w:rPr>
+          <w:b w:val="0"/>
+          <w:bCs w:val="0"/>
+        </w:rPr>
+      </w:pPr>
+      <w:r>
+        <w:rPr>
+          <w:b w:val="0"/>
+          <w:bCs w:val="0"/>
+        </w:rPr>
+        <w:t>       - `Location = new Location(poi.Latitude, poi.Longitude)` (vị trí ghim)</w:t>
+      </w:r>
+    </w:p>
+    <w:p>
+      <w:pPr>
+        <w:pStyle w:val="Heading3"/>
+        <w:rPr>
+          <w:b w:val="0"/>
+          <w:bCs w:val="0"/>
+        </w:rPr>
+      </w:pPr>
+      <w:r>
+        <w:rPr>
+          <w:b w:val="0"/>
+          <w:bCs w:val="0"/>
+        </w:rPr>
+        <w:t>       - `BindingContext = poi` (gắn toàn bộ object Poi vào Pin để dùng khi click)</w:t>
+      </w:r>
+    </w:p>
+    <w:p>
+      <w:pPr>
+        <w:pStyle w:val="Heading3"/>
+        <w:rPr>
+          <w:b w:val="0"/>
+          <w:bCs w:val="0"/>
+        </w:rPr>
+      </w:pPr>
+      <w:r>
+        <w:rPr>
+          <w:b w:val="0"/>
+          <w:bCs w:val="0"/>
+        </w:rPr>
+        <w:t>     - `bigMap.Pins.Add(pin)` — thêm pin vào bản đồ.</w:t>
+      </w:r>
+    </w:p>
+    <w:p>
+      <w:pPr>
+        <w:pStyle w:val="Heading3"/>
+        <w:rPr>
+          <w:b w:val="0"/>
+          <w:bCs w:val="0"/>
+        </w:rPr>
+      </w:pPr>
+      <w:r>
+        <w:rPr>
+          <w:b w:val="0"/>
+          <w:bCs w:val="0"/>
+        </w:rPr>
+        <w:t>     - `pin.MarkerClicked += OnPinClicked` — đăng ký event handler khi du khách bấm pin.</w:t>
+      </w:r>
+    </w:p>
+    <w:p>
+      <w:pPr>
+        <w:pStyle w:val="Heading3"/>
+        <w:rPr>
+          <w:b w:val="0"/>
+          <w:bCs w:val="0"/>
+        </w:rPr>
+      </w:pPr>
+      <w:r>
+        <w:t>Bước 33–44:</w:t>
+      </w:r>
+      <w:r>
+        <w:rPr>
+          <w:b w:val="0"/>
+          <w:bCs w:val="0"/>
+        </w:rPr>
+        <w:t xml:space="preserve"> Du khách bấm Pin xem chi tiết (Giai đoạn 4)**</w:t>
+      </w:r>
+    </w:p>
+    <w:p>
+      <w:pPr>
+        <w:pStyle w:val="Heading3"/>
+        <w:rPr>
+          <w:b w:val="0"/>
+          <w:bCs w:val="0"/>
+        </w:rPr>
+      </w:pPr>
+      <w:r>
+        <w:rPr>
+          <w:b w:val="0"/>
+          <w:bCs w:val="0"/>
+        </w:rPr>
+        <w:t>Khi du khách bấm vào một Pin trên bản đồ:</w:t>
+      </w:r>
+    </w:p>
+    <w:p>
+      <w:pPr>
+        <w:pStyle w:val="Heading3"/>
+        <w:rPr>
+          <w:b w:val="0"/>
+          <w:bCs w:val="0"/>
+        </w:rPr>
+      </w:pPr>
+      <w:r>
+        <w:rPr>
+          <w:b w:val="0"/>
+          <w:bCs w:val="0"/>
+        </w:rPr>
+        <w:t>1. `OnPinClicked(sender, PinClickedEventArgs)` được gọi.</w:t>
+      </w:r>
+    </w:p>
+    <w:p>
+      <w:pPr>
+        <w:pStyle w:val="Heading3"/>
+        <w:rPr>
+          <w:b w:val="0"/>
+          <w:bCs w:val="0"/>
+        </w:rPr>
+      </w:pPr>
+      <w:r>
+        <w:rPr>
+          <w:b w:val="0"/>
+          <w:bCs w:val="0"/>
+        </w:rPr>
+        <w:t>2. Ép kiểu: `sender as Pin` → lấy `pin.BindingContext as Poi` để truy xuất `PoiId`.</w:t>
+      </w:r>
+    </w:p>
+    <w:p>
+      <w:pPr>
+        <w:pStyle w:val="Heading3"/>
+        <w:rPr>
+          <w:b w:val="0"/>
+          <w:bCs w:val="0"/>
+        </w:rPr>
+      </w:pPr>
+      <w:r>
+        <w:rPr>
+          <w:b w:val="0"/>
+          <w:bCs w:val="0"/>
+        </w:rPr>
+        <w:t>3. Đặt `e.HideInfoWindow = false` — cho phép tooltip (tên + địa chỉ) vẫn hiện.</w:t>
+      </w:r>
+    </w:p>
+    <w:p>
+      <w:pPr>
+        <w:pStyle w:val="Heading3"/>
+        <w:rPr>
+          <w:b w:val="0"/>
+          <w:bCs w:val="0"/>
+        </w:rPr>
+      </w:pPr>
+      <w:r>
+        <w:rPr>
+          <w:b w:val="0"/>
+          <w:bCs w:val="0"/>
+        </w:rPr>
+        <w:lastRenderedPageBreak/>
+        <w:t>4. Điều hướng: `Shell.Current.GoToAsync($"{nameof(StallDetailPage)}?poiId={poi.PoiId}")` — truyền `poiId` qua `QueryProperty`.</w:t>
+      </w:r>
+    </w:p>
+    <w:p>
+      <w:pPr>
+        <w:pStyle w:val="Heading3"/>
+        <w:rPr>
+          <w:b w:val="0"/>
+          <w:bCs w:val="0"/>
+        </w:rPr>
+      </w:pPr>
+      <w:r>
+        <w:rPr>
+          <w:b w:val="0"/>
+          <w:bCs w:val="0"/>
+        </w:rPr>
+        <w:t>`StallDetailPage` nhận `poiId`, gọi `StallDetailViewModel.LoadAsync(poiId)` → `DataService.GetPoiDetailAsync(poiId)` → `HTTP GET /api/Poi/{id}/detail`.</w:t>
+      </w:r>
+    </w:p>
+    <w:p>
+      <w:pPr>
+        <w:pStyle w:val="Heading3"/>
+        <w:rPr>
+          <w:b w:val="0"/>
+          <w:bCs w:val="0"/>
+        </w:rPr>
+      </w:pPr>
+      <w:r>
+        <w:rPr>
+          <w:b w:val="0"/>
+          <w:bCs w:val="0"/>
+        </w:rPr>
+        <w:t>API trả về `PoiDetailDto` đầy đủ:</w:t>
+      </w:r>
+    </w:p>
+    <w:p>
+      <w:pPr>
+        <w:pStyle w:val="Heading3"/>
+        <w:rPr>
+          <w:b w:val="0"/>
+          <w:bCs w:val="0"/>
+        </w:rPr>
+      </w:pPr>
+      <w:r>
+        <w:rPr>
+          <w:b w:val="0"/>
+          <w:bCs w:val="0"/>
+        </w:rPr>
+        <w:t>- Thông tin quán: Name, Address, Description, CoverImageUrl</w:t>
+      </w:r>
+    </w:p>
+    <w:p>
+      <w:pPr>
+        <w:pStyle w:val="Heading3"/>
+        <w:rPr>
+          <w:b w:val="0"/>
+          <w:bCs w:val="0"/>
+        </w:rPr>
+      </w:pPr>
+      <w:r>
+        <w:rPr>
+          <w:b w:val="0"/>
+          <w:bCs w:val="0"/>
+        </w:rPr>
+        <w:t>- Gallery ảnh: List `ImageItemDto` (Id, Url, AltText)</w:t>
+      </w:r>
+    </w:p>
+    <w:p>
+      <w:pPr>
+        <w:pStyle w:val="Heading3"/>
+        <w:rPr>
+          <w:b w:val="0"/>
+          <w:bCs w:val="0"/>
+        </w:rPr>
+      </w:pPr>
+      <w:r>
+        <w:rPr>
+          <w:b w:val="0"/>
+          <w:bCs w:val="0"/>
+        </w:rPr>
+        <w:t>- Thực đơn: List `MenuItemDto` (Name, Category, Price, Description, ImageUrl, AudioUrl)</w:t>
+      </w:r>
+    </w:p>
+    <w:p>
+      <w:pPr>
+        <w:pStyle w:val="Heading3"/>
+        <w:rPr>
+          <w:b w:val="0"/>
+          <w:bCs w:val="0"/>
+        </w:rPr>
+      </w:pPr>
+      <w:r>
+        <w:rPr>
+          <w:b w:val="0"/>
+          <w:bCs w:val="0"/>
+        </w:rPr>
+        <w:t>- Audio thuyết minh: List `AudioItemDto` gồm 3 loại:</w:t>
+      </w:r>
+    </w:p>
+    <w:p>
+      <w:pPr>
+        <w:pStyle w:val="Heading3"/>
+        <w:rPr>
+          <w:b w:val="0"/>
+          <w:bCs w:val="0"/>
+        </w:rPr>
+      </w:pPr>
+      <w:r>
+        <w:rPr>
+          <w:b w:val="0"/>
+          <w:bCs w:val="0"/>
+        </w:rPr>
+        <w:t>  - `auto_nearby`: audio tự động khi đến gần POI (AudioUrlAuto)</w:t>
+      </w:r>
+    </w:p>
+    <w:p>
+      <w:pPr>
+        <w:pStyle w:val="Heading3"/>
+        <w:rPr>
+          <w:b w:val="0"/>
+          <w:bCs w:val="0"/>
+        </w:rPr>
+      </w:pPr>
+      <w:r>
+        <w:rPr>
+          <w:b w:val="0"/>
+          <w:bCs w:val="0"/>
+        </w:rPr>
+        <w:t>  - `qr_scan`: audio khi quét QR (AudioUrlQr)</w:t>
+      </w:r>
+    </w:p>
+    <w:p>
+      <w:pPr>
+        <w:pStyle w:val="Heading3"/>
+        <w:rPr>
+          <w:b w:val="0"/>
+          <w:bCs w:val="0"/>
+        </w:rPr>
+      </w:pPr>
+      <w:r>
+        <w:rPr>
+          <w:b w:val="0"/>
+          <w:bCs w:val="0"/>
+        </w:rPr>
+        <w:t>  - `menu`: audio mô tả món ăn</w:t>
+      </w:r>
+    </w:p>
+    <w:p>
+      <w:pPr>
+        <w:pStyle w:val="Heading3"/>
+        <w:rPr>
+          <w:b w:val="0"/>
+          <w:bCs w:val="0"/>
+        </w:rPr>
+      </w:pPr>
+      <w:r>
+        <w:rPr>
+          <w:b w:val="0"/>
+          <w:bCs w:val="0"/>
+        </w:rPr>
+        <w:t>DataService gọi `NormalizeMediaUrl()` chuyển đổi URL tương đối (VD: `/uploads/poi/image.jpg`) thành URL tuyệt đối (VD: `http://10.0.2.2:5242/uploads/poi/image.jpg`) để app hiển thị được ảnh và phát được audio.</w:t>
+      </w:r>
+    </w:p>
+    <w:p>
+      <w:pPr>
+        <w:pStyle w:val="Heading3"/>
+      </w:pPr>
+      <w:r>
+        <w:t>6.4. Xử lý ngoại lệ</w:t>
+      </w:r>
+    </w:p>
+    <w:p>
+      <w:pPr>
+        <w:pStyle w:val="Heading3"/>
+        <w:rPr>
+          <w:b w:val="0"/>
+          <w:bCs w:val="0"/>
+        </w:rPr>
+      </w:pPr>
+      <w:r>
+        <w:rPr>
+          <w:b w:val="0"/>
+          <w:bCs w:val="0"/>
+        </w:rPr>
+        <w:t>- **API lỗi khi tải danh sách POI**: DataService trả về `FallbackDemo()` — 2 quán giả với tọa độ cố định. Bản đồ vẫn hiển thị 2 pin demo.</w:t>
+      </w:r>
+    </w:p>
+    <w:p>
+      <w:pPr>
+        <w:pStyle w:val="Heading3"/>
+        <w:rPr>
+          <w:b w:val="0"/>
+          <w:bCs w:val="0"/>
+        </w:rPr>
+      </w:pPr>
+      <w:r>
+        <w:rPr>
+          <w:b w:val="0"/>
+          <w:bCs w:val="0"/>
+        </w:rPr>
+        <w:t>- **POI có tọa độ (0, 0)**: `ApplyPinsFromViewModel()` bỏ qua (so sánh `Math.Abs &lt; double.Epsilon`), không gắn pin vô nghĩa.</w:t>
+      </w:r>
+    </w:p>
+    <w:p>
+      <w:pPr>
+        <w:pStyle w:val="Heading3"/>
+        <w:rPr>
+          <w:b w:val="0"/>
+          <w:bCs w:val="0"/>
+        </w:rPr>
+      </w:pPr>
+      <w:r>
+        <w:rPr>
+          <w:b w:val="0"/>
+          <w:bCs w:val="0"/>
+        </w:rPr>
+        <w:t>- **Bản đồ chưa load kịp / Google Maps lỗi**: `OnAppearing()` vẫn gọi được nhưng `MoveToRegion` có thể không có hiệu ứng. Pin vẫn được thêm vào collection.</w:t>
+      </w:r>
+    </w:p>
+    <w:p>
+      <w:pPr>
+        <w:pStyle w:val="Heading3"/>
+        <w:rPr>
+          <w:b w:val="0"/>
+          <w:bCs w:val="0"/>
+        </w:rPr>
+      </w:pPr>
+      <w:r>
+        <w:rPr>
+          <w:b w:val="0"/>
+          <w:bCs w:val="0"/>
+        </w:rPr>
+        <w:t>- **API chi tiết lỗi khi bấm Pin**: `GetPoiDetailAsync()` catch exception, return `null`. StallDetailPage hiển thị trạng thái trống hoặc thông báo lỗi.</w:t>
+      </w:r>
+    </w:p>
+    <w:p>
+      <w:pPr>
+        <w:pStyle w:val="Heading3"/>
+        <w:rPr>
+          <w:b w:val="0"/>
+          <w:bCs w:val="0"/>
+        </w:rPr>
+      </w:pPr>
+      <w:r>
+        <w:rPr>
+          <w:b w:val="0"/>
+          <w:bCs w:val="0"/>
+        </w:rPr>
+        <w:t xml:space="preserve">- **Nút </w:t>
+      </w:r>
+      <w:r>
+        <w:rPr>
+          <w:rFonts w:ascii="Segoe UI Emoji" w:hAnsi="Segoe UI Emoji" w:cs="Segoe UI Emoji"/>
+          <w:b w:val="0"/>
+          <w:bCs w:val="0"/>
+        </w:rPr>
+        <w:t>🎯</w:t>
+      </w:r>
+      <w:r>
+        <w:rPr>
+          <w:b w:val="0"/>
+          <w:bCs w:val="0"/>
+        </w:rPr>
+        <w:t xml:space="preserve"> (Center on Street)**: khi du khách lạc vị trí bản đồ, bấm nút này gọi `OnCenterOnStreet()` → `MoveToRegion` quay lại trung tâm Vĩnh Khánh.</w:t>
+      </w:r>
+    </w:p>
+    <w:p>
+      <w:pPr>
+        <w:pStyle w:val="Heading3"/>
+      </w:pPr>
+      <w:r>
+        <w:t>6.5. Kết quả đầu ra</w:t>
+      </w:r>
+    </w:p>
+    <w:p>
+      <w:pPr>
+        <w:pStyle w:val="Heading3"/>
+        <w:rPr>
+          <w:b w:val="0"/>
+          <w:bCs w:val="0"/>
+        </w:rPr>
+      </w:pPr>
+      <w:r>
+        <w:rPr>
+          <w:b w:val="0"/>
+          <w:bCs w:val="0"/>
+        </w:rPr>
+        <w:t>- Bản đồ toàn màn hình hiển thị vùng Vĩnh Khánh, zoom 500m.</w:t>
+      </w:r>
+    </w:p>
+    <w:p>
+      <w:pPr>
+        <w:pStyle w:val="Heading3"/>
+        <w:rPr>
+          <w:b w:val="0"/>
+          <w:bCs w:val="0"/>
+        </w:rPr>
+      </w:pPr>
+      <w:r>
+        <w:rPr>
+          <w:b w:val="0"/>
+          <w:bCs w:val="0"/>
+        </w:rPr>
+        <w:t>- Mỗi gian hàng active có tọa độ hợp lệ được biểu diễn bằng 1 Pin trên bản đồ.</w:t>
+      </w:r>
+    </w:p>
+    <w:p>
+      <w:pPr>
+        <w:pStyle w:val="Heading3"/>
+        <w:rPr>
+          <w:b w:val="0"/>
+          <w:bCs w:val="0"/>
+        </w:rPr>
+      </w:pPr>
+      <w:r>
+        <w:rPr>
+          <w:b w:val="0"/>
+          <w:bCs w:val="0"/>
+        </w:rPr>
+        <w:lastRenderedPageBreak/>
+        <w:t>- Du khách bấm Pin → tooltip hiện tên + địa chỉ → điều hướng đến trang chi tiết gian hàng với đầy đủ ảnh, thực đơn, audio thuyết minh.</w:t>
+      </w:r>
+    </w:p>
+    <w:p>
+      <w:pPr>
+        <w:pStyle w:val="Heading3"/>
+        <w:rPr>
+          <w:b w:val="0"/>
+          <w:bCs w:val="0"/>
+        </w:rPr>
+      </w:pPr>
+      <w:r>
+        <w:rPr>
+          <w:b w:val="0"/>
+          <w:bCs w:val="0"/>
+        </w:rPr>
+        <w:t xml:space="preserve">- Nút </w:t>
+      </w:r>
+      <w:r>
+        <w:rPr>
+          <w:rFonts w:ascii="Segoe UI Emoji" w:hAnsi="Segoe UI Emoji" w:cs="Segoe UI Emoji"/>
+          <w:b w:val="0"/>
+          <w:bCs w:val="0"/>
+        </w:rPr>
+        <w:t>🎯</w:t>
+      </w:r>
+      <w:r>
+        <w:rPr>
+          <w:b w:val="0"/>
+          <w:bCs w:val="0"/>
+        </w:rPr>
+        <w:t xml:space="preserve"> góc phải dưới cho phép quay lại trung tâm phố ẩm thực bất kỳ lúc nào.</w:t>
+      </w:r>
+    </w:p>
+    <w:p>
+      <w:pPr>
+        <w:pStyle w:val="Heading3"/>
       </w:pPr>
     </w:p>
     <w:sectPr>
-      <w:headerReference w:type="default" r:id="rId17"/>
-      <w:footerReference w:type="default" r:id="rId18"/>
+      <w:headerReference w:type="default" r:id="rId18"/>
+      <w:footerReference w:type="default" r:id="rId19"/>
       <w:pgSz w:w="12240" w:h="15840"/>
       <w:pgMar w:top="1440" w:right="1440" w:bottom="1440" w:left="1440" w:header="708" w:footer="708" w:gutter="0"/>
       <w:cols w:space="720"/>
@@ -11427,7 +12481,6 @@
   <w:style w:type="character" w:default="1" w:styleId="DefaultParagraphFont">
     <w:name w:val="Default Paragraph Font"/>
     <w:uiPriority w:val="1"/>
-    <w:semiHidden/>
     <w:unhideWhenUsed/>
   </w:style>
   <w:style w:type="table" w:default="1" w:styleId="TableNormal">

</xml_diff>